<commit_message>
Reduce whitespace in all Word documents
- Removed 224 consecutive empty paragraphs across 48 documents
- Reduced excessive space_after values on empty spacer paragraphs (capped at 3pt)
- Reduced space_after on content paragraphs exceeding 6pt

https://claude.ai/code/session_01NC7ETFqUooirTCpjhGMGE5
</commit_message>
<xml_diff>
--- a/Opgave 1 Zorgverzekering/Opgave 1 Zorgverzekering – antwoorden.docx
+++ b/Opgave 1 Zorgverzekering/Opgave 1 Zorgverzekering – antwoorden.docx
@@ -36,7 +36,7 @@
     </w:p>
     <w:p>
       <w:pPr>
-        <w:spacing w:after="240"/>
+        <w:spacing w:after="120"/>
       </w:pPr>
       <w:r>
         <w:rPr>
@@ -65,11 +65,6 @@
     <w:p>
       <w:pPr>
         <w:spacing w:after="80"/>
-      </w:pPr>
-    </w:p>
-    <w:p>
-      <w:pPr>
-        <w:spacing w:after="120"/>
       </w:pPr>
     </w:p>
     <w:tbl>
@@ -303,11 +298,6 @@
     </w:p>
     <w:p>
       <w:pPr>
-        <w:spacing w:after="160"/>
-      </w:pPr>
-    </w:p>
-    <w:p>
-      <w:pPr>
         <w:spacing w:after="120"/>
       </w:pPr>
       <w:r>
@@ -323,11 +313,6 @@
     <w:p>
       <w:pPr>
         <w:spacing w:after="80"/>
-      </w:pPr>
-    </w:p>
-    <w:p>
-      <w:pPr>
-        <w:spacing w:after="120"/>
       </w:pPr>
     </w:p>
     <w:tbl>
@@ -557,11 +542,6 @@
     <w:p>
       <w:pPr>
         <w:spacing w:after="40"/>
-      </w:pPr>
-    </w:p>
-    <w:p>
-      <w:pPr>
-        <w:spacing w:after="160"/>
       </w:pPr>
     </w:p>
     <w:p>
@@ -914,11 +894,6 @@
         <w:spacing w:after="80"/>
       </w:pPr>
     </w:p>
-    <w:p>
-      <w:pPr>
-        <w:spacing w:after="120"/>
-      </w:pPr>
-    </w:p>
     <w:tbl>
       <w:tblPr>
         <w:tblW w:type="dxa" w:w="2400"/>
@@ -1150,11 +1125,6 @@
     </w:p>
     <w:p>
       <w:pPr>
-        <w:spacing w:after="160"/>
-      </w:pPr>
-    </w:p>
-    <w:p>
-      <w:pPr>
         <w:spacing w:after="120"/>
       </w:pPr>
       <w:r>
@@ -1170,11 +1140,6 @@
     <w:p>
       <w:pPr>
         <w:spacing w:after="80"/>
-      </w:pPr>
-    </w:p>
-    <w:p>
-      <w:pPr>
-        <w:spacing w:after="120"/>
       </w:pPr>
     </w:p>
     <w:tbl>
@@ -1408,11 +1373,6 @@
     </w:p>
     <w:p>
       <w:pPr>
-        <w:spacing w:after="160"/>
-      </w:pPr>
-    </w:p>
-    <w:p>
-      <w:pPr>
         <w:spacing w:after="120"/>
       </w:pPr>
       <w:r>
@@ -1428,11 +1388,6 @@
     <w:p>
       <w:pPr>
         <w:spacing w:after="80"/>
-      </w:pPr>
-    </w:p>
-    <w:p>
-      <w:pPr>
-        <w:spacing w:after="120"/>
       </w:pPr>
     </w:p>
     <w:tbl>
@@ -1666,11 +1621,6 @@
     </w:p>
     <w:p>
       <w:pPr>
-        <w:spacing w:after="160"/>
-      </w:pPr>
-    </w:p>
-    <w:p>
-      <w:pPr>
         <w:spacing w:after="120"/>
       </w:pPr>
       <w:r>
@@ -1686,11 +1636,6 @@
     <w:p>
       <w:pPr>
         <w:spacing w:after="80"/>
-      </w:pPr>
-    </w:p>
-    <w:p>
-      <w:pPr>
-        <w:spacing w:after="120"/>
       </w:pPr>
     </w:p>
     <w:tbl>

</xml_diff>